<commit_message>
added 3. fasta file
</commit_message>
<xml_diff>
--- a/Exercise 1.docx
+++ b/Exercise 1.docx
@@ -217,7 +217,7 @@
           <w:highlight w:val="yellow"/>
         </w:rPr>
         <w:drawing>
-          <wp:inline distT="0" distB="0" distL="0" distR="0" wp14:anchorId="75B4FC5B" wp14:editId="699076EF">
+          <wp:inline distT="0" distB="0" distL="0" distR="0" wp14:anchorId="75B4FC5B" wp14:editId="3AC37E7E">
             <wp:extent cx="4906108" cy="3488522"/>
             <wp:effectExtent l="0" t="0" r="0" b="4445"/>
             <wp:docPr id="1517461047" name="Picture 1" descr="A screenshot of a computer&#10;&#10;AI-generated content may be incorrect."/>
@@ -489,7 +489,41 @@
         <w:ind w:left="720"/>
       </w:pPr>
       <w:r>
-        <w:t>Best local alignment score: 228</w:t>
+        <w:drawing>
+          <wp:inline distT="0" distB="0" distL="0" distR="0" wp14:anchorId="6AFE54CD" wp14:editId="3A083E19">
+            <wp:extent cx="1676400" cy="673100"/>
+            <wp:effectExtent l="0" t="0" r="0" b="0"/>
+            <wp:docPr id="772003002" name="Picture 1"/>
+            <wp:cNvGraphicFramePr>
+              <a:graphicFrameLocks xmlns:a="http://schemas.openxmlformats.org/drawingml/2006/main" noChangeAspect="1"/>
+            </wp:cNvGraphicFramePr>
+            <a:graphic xmlns:a="http://schemas.openxmlformats.org/drawingml/2006/main">
+              <a:graphicData uri="http://schemas.openxmlformats.org/drawingml/2006/picture">
+                <pic:pic xmlns:pic="http://schemas.openxmlformats.org/drawingml/2006/picture">
+                  <pic:nvPicPr>
+                    <pic:cNvPr id="772003002" name=""/>
+                    <pic:cNvPicPr/>
+                  </pic:nvPicPr>
+                  <pic:blipFill>
+                    <a:blip r:embed="rId7"/>
+                    <a:stretch>
+                      <a:fillRect/>
+                    </a:stretch>
+                  </pic:blipFill>
+                  <pic:spPr>
+                    <a:xfrm>
+                      <a:off x="0" y="0"/>
+                      <a:ext cx="1676400" cy="673100"/>
+                    </a:xfrm>
+                    <a:prstGeom prst="rect">
+                      <a:avLst/>
+                    </a:prstGeom>
+                  </pic:spPr>
+                </pic:pic>
+              </a:graphicData>
+            </a:graphic>
+          </wp:inline>
+        </w:drawing>
       </w:r>
     </w:p>
     <w:p>
@@ -505,7 +539,7 @@
           <w:noProof/>
         </w:rPr>
         <w:drawing>
-          <wp:inline distT="0" distB="0" distL="0" distR="0" wp14:anchorId="32BD5030" wp14:editId="2234565D">
+          <wp:inline distT="0" distB="0" distL="0" distR="0" wp14:anchorId="32BD5030" wp14:editId="30A16599">
             <wp:extent cx="3961991" cy="2039815"/>
             <wp:effectExtent l="0" t="0" r="635" b="5080"/>
             <wp:docPr id="185539129" name="Picture 2" descr="A screenshot of a computer screen&#10;&#10;AI-generated content may be incorrect."/>
@@ -520,7 +554,7 @@
                     <pic:cNvPicPr/>
                   </pic:nvPicPr>
                   <pic:blipFill>
-                    <a:blip r:embed="rId7" cstate="print">
+                    <a:blip r:embed="rId8" cstate="print">
                       <a:extLst>
                         <a:ext uri="{28A0092B-C50C-407E-A947-70E740481C1C}">
                           <a14:useLocalDpi xmlns:a14="http://schemas.microsoft.com/office/drawing/2010/main" val="0"/>
@@ -635,18 +669,13 @@
     <w:p>
       <w:pPr>
         <w:pStyle w:val="ListParagraph"/>
-        <w:rPr>
-          <w:b/>
-          <w:bCs/>
-        </w:rPr>
       </w:pPr>
       <w:r>
         <w:rPr>
           <w:noProof/>
         </w:rPr>
-        <w:lastRenderedPageBreak/>
         <w:drawing>
-          <wp:inline distT="0" distB="0" distL="0" distR="0" wp14:anchorId="7C3CAAB4" wp14:editId="126E07F7">
+          <wp:inline distT="0" distB="0" distL="0" distR="0" wp14:anchorId="7C3CAAB4" wp14:editId="38730C08">
             <wp:extent cx="3996146" cy="2057400"/>
             <wp:effectExtent l="0" t="0" r="4445" b="0"/>
             <wp:docPr id="2016463692" name="Picture 2" descr="A screenshot of a computer screen&#10;&#10;AI-generated content may be incorrect."/>
@@ -661,7 +690,7 @@
                     <pic:cNvPicPr/>
                   </pic:nvPicPr>
                   <pic:blipFill>
-                    <a:blip r:embed="rId7" cstate="print">
+                    <a:blip r:embed="rId8" cstate="print">
                       <a:extLst>
                         <a:ext uri="{28A0092B-C50C-407E-A947-70E740481C1C}">
                           <a14:useLocalDpi xmlns:a14="http://schemas.microsoft.com/office/drawing/2010/main" val="0"/>
@@ -687,6 +716,15 @@
           </wp:inline>
         </w:drawing>
       </w:r>
+    </w:p>
+    <w:p>
+      <w:pPr>
+        <w:pStyle w:val="ListParagraph"/>
+        <w:rPr>
+          <w:b/>
+          <w:bCs/>
+        </w:rPr>
+      </w:pPr>
       <w:r>
         <w:rPr>
           <w:noProof/>
@@ -737,11 +775,16 @@
     <w:p>
       <w:pPr>
         <w:pStyle w:val="ListParagraph"/>
-        <w:rPr>
-          <w:b/>
-          <w:bCs/>
-        </w:rPr>
-      </w:pPr>
+      </w:pPr>
+      <w:r>
+        <w:t>The only descrepancy between the two alignments is that matching aminoacids</w:t>
+      </w:r>
+      <w:r>
+        <w:t xml:space="preserve">, from my code, </w:t>
+      </w:r>
+      <w:r>
+        <w:t>are marked as | instead of written out.</w:t>
+      </w:r>
     </w:p>
     <w:p>
       <w:pPr>
@@ -768,13 +811,42 @@
         <w:pStyle w:val="ListParagraph"/>
       </w:pPr>
       <w:r>
-        <w:t>Best local alignment score: 48</w:t>
-      </w:r>
-    </w:p>
-    <w:p>
-      <w:pPr>
-        <w:pStyle w:val="ListParagraph"/>
-      </w:pPr>
+        <w:drawing>
+          <wp:inline distT="0" distB="0" distL="0" distR="0" wp14:anchorId="35F644DD" wp14:editId="43BCAEBF">
+            <wp:extent cx="1612900" cy="660400"/>
+            <wp:effectExtent l="0" t="0" r="0" b="0"/>
+            <wp:docPr id="946563297" name="Picture 1"/>
+            <wp:cNvGraphicFramePr>
+              <a:graphicFrameLocks xmlns:a="http://schemas.openxmlformats.org/drawingml/2006/main" noChangeAspect="1"/>
+            </wp:cNvGraphicFramePr>
+            <a:graphic xmlns:a="http://schemas.openxmlformats.org/drawingml/2006/main">
+              <a:graphicData uri="http://schemas.openxmlformats.org/drawingml/2006/picture">
+                <pic:pic xmlns:pic="http://schemas.openxmlformats.org/drawingml/2006/picture">
+                  <pic:nvPicPr>
+                    <pic:cNvPr id="946563297" name=""/>
+                    <pic:cNvPicPr/>
+                  </pic:nvPicPr>
+                  <pic:blipFill>
+                    <a:blip r:embed="rId9"/>
+                    <a:stretch>
+                      <a:fillRect/>
+                    </a:stretch>
+                  </pic:blipFill>
+                  <pic:spPr>
+                    <a:xfrm>
+                      <a:off x="0" y="0"/>
+                      <a:ext cx="1612900" cy="660400"/>
+                    </a:xfrm>
+                    <a:prstGeom prst="rect">
+                      <a:avLst/>
+                    </a:prstGeom>
+                  </pic:spPr>
+                </pic:pic>
+              </a:graphicData>
+            </a:graphic>
+          </wp:inline>
+        </w:drawing>
+      </w:r>
       <w:r>
         <w:rPr>
           <w:noProof/>
@@ -795,7 +867,7 @@
                     <pic:cNvPicPr/>
                   </pic:nvPicPr>
                   <pic:blipFill>
-                    <a:blip r:embed="rId8">
+                    <a:blip r:embed="rId10">
                       <a:extLst>
                         <a:ext uri="{28A0092B-C50C-407E-A947-70E740481C1C}">
                           <a14:useLocalDpi xmlns:a14="http://schemas.microsoft.com/office/drawing/2010/main" val="0"/>
@@ -831,6 +903,22 @@
       <w:pPr>
         <w:pStyle w:val="ListParagraph"/>
       </w:pPr>
+    </w:p>
+    <w:p>
+      <w:pPr>
+        <w:pStyle w:val="ListParagraph"/>
+      </w:pPr>
+      <w:r>
+        <w:t>Delcartion of use of AI:</w:t>
+      </w:r>
+    </w:p>
+    <w:p>
+      <w:pPr>
+        <w:pStyle w:val="ListParagraph"/>
+      </w:pPr>
+      <w:r>
+        <w:t>I have used Claude to help with programming the alghoritm and the blast like showcase.</w:t>
+      </w:r>
     </w:p>
     <w:sectPr>
       <w:pgSz w:w="11906" w:h="16838"/>

</xml_diff>